<commit_message>
format: apply academic hierarchical indentation to sub-chapters, paragraphs, lists, and quotes
</commit_message>
<xml_diff>
--- a/docs/TimKilasTugas_KilasTugas_Proposal.docx
+++ b/docs/TimKilasTugas_KilasTugas_Proposal.docx
@@ -51,7 +51,7 @@
           <w:noProof/>
         </w:rPr>
         <w:drawing>
-          <wp:inline distT="0" distB="0" distL="0" distR="0">
+          <wp:inline distT="0" distB="0" distL="0" distR="0" wp14:anchorId="7EA972AB" wp14:editId="45A1006F">
             <wp:extent cx="1645920" cy="1645920"/>
             <wp:effectExtent l="0" t="0" r="0" b="0"/>
             <wp:docPr id="1" name="Picture 1"/>
@@ -566,6 +566,7 @@
       <w:pPr>
         <w:keepNext/>
         <w:spacing w:before="120" w:after="40"/>
+        <w:ind w:left="576"/>
       </w:pPr>
       <w:r>
         <w:rPr>
@@ -577,6 +578,7 @@
     <w:p>
       <w:pPr>
         <w:spacing w:after="50"/>
+        <w:ind w:left="576" w:firstLine="504"/>
         <w:jc w:val="both"/>
       </w:pPr>
       <w:r>
@@ -586,6 +588,7 @@
     <w:p>
       <w:pPr>
         <w:spacing w:after="50"/>
+        <w:ind w:left="576" w:firstLine="504"/>
         <w:jc w:val="both"/>
       </w:pPr>
       <w:r>
@@ -641,6 +644,7 @@
       <w:pPr>
         <w:keepNext/>
         <w:spacing w:before="120" w:after="40"/>
+        <w:ind w:left="576"/>
       </w:pPr>
       <w:r>
         <w:rPr>
@@ -652,6 +656,7 @@
     <w:p>
       <w:pPr>
         <w:spacing w:after="50"/>
+        <w:ind w:left="576" w:firstLine="504"/>
         <w:jc w:val="both"/>
       </w:pPr>
       <w:r>
@@ -670,7 +675,7 @@
     <w:p>
       <w:pPr>
         <w:spacing w:after="40"/>
-        <w:ind w:left="432" w:hanging="360"/>
+        <w:ind w:left="1008" w:hanging="360"/>
         <w:jc w:val="both"/>
       </w:pPr>
       <w:r>
@@ -686,7 +691,7 @@
     <w:p>
       <w:pPr>
         <w:spacing w:after="40"/>
-        <w:ind w:left="432" w:hanging="360"/>
+        <w:ind w:left="1008" w:hanging="360"/>
         <w:jc w:val="both"/>
       </w:pPr>
       <w:r>
@@ -711,7 +716,7 @@
     <w:p>
       <w:pPr>
         <w:spacing w:after="40"/>
-        <w:ind w:left="432" w:hanging="360"/>
+        <w:ind w:left="1008" w:hanging="360"/>
         <w:jc w:val="both"/>
       </w:pPr>
       <w:r>
@@ -728,6 +733,7 @@
       <w:pPr>
         <w:keepNext/>
         <w:spacing w:before="120" w:after="40"/>
+        <w:ind w:left="576"/>
       </w:pPr>
       <w:r>
         <w:rPr>
@@ -739,7 +745,7 @@
     <w:p>
       <w:pPr>
         <w:spacing w:before="80" w:after="80"/>
-        <w:ind w:left="576" w:right="576"/>
+        <w:ind w:left="1152" w:right="576"/>
         <w:jc w:val="both"/>
       </w:pPr>
       <w:r>
@@ -765,6 +771,7 @@
     <w:p>
       <w:pPr>
         <w:spacing w:after="50"/>
+        <w:ind w:left="576" w:firstLine="504"/>
         <w:jc w:val="both"/>
       </w:pPr>
       <w:r>
@@ -775,6 +782,7 @@
       <w:pPr>
         <w:keepNext/>
         <w:spacing w:before="120" w:after="40"/>
+        <w:ind w:left="576"/>
       </w:pPr>
       <w:r>
         <w:rPr>
@@ -786,7 +794,7 @@
     <w:p>
       <w:pPr>
         <w:spacing w:after="40"/>
-        <w:ind w:left="432" w:hanging="288"/>
+        <w:ind w:left="1008" w:hanging="288"/>
         <w:jc w:val="both"/>
       </w:pPr>
       <w:r>
@@ -814,7 +822,7 @@
     <w:p>
       <w:pPr>
         <w:spacing w:after="40"/>
-        <w:ind w:left="432" w:hanging="288"/>
+        <w:ind w:left="1008" w:hanging="288"/>
         <w:jc w:val="both"/>
       </w:pPr>
       <w:r>
@@ -851,7 +859,7 @@
     <w:p>
       <w:pPr>
         <w:spacing w:after="40"/>
-        <w:ind w:left="432" w:hanging="288"/>
+        <w:ind w:left="1008" w:hanging="288"/>
         <w:jc w:val="both"/>
       </w:pPr>
       <w:r>
@@ -898,6 +906,7 @@
       <w:pPr>
         <w:keepNext/>
         <w:spacing w:before="120" w:after="40"/>
+        <w:ind w:left="576"/>
       </w:pPr>
       <w:r>
         <w:rPr>
@@ -909,6 +918,7 @@
     <w:p>
       <w:pPr>
         <w:spacing w:after="50"/>
+        <w:ind w:left="576" w:firstLine="504"/>
         <w:jc w:val="both"/>
       </w:pPr>
       <w:r>
@@ -1378,6 +1388,7 @@
       <w:pPr>
         <w:keepNext/>
         <w:spacing w:before="120" w:after="40"/>
+        <w:ind w:left="576"/>
       </w:pPr>
       <w:r>
         <w:rPr>
@@ -1389,7 +1400,7 @@
     <w:p>
       <w:pPr>
         <w:spacing w:after="40"/>
-        <w:ind w:left="432" w:hanging="288"/>
+        <w:ind w:left="1008" w:hanging="288"/>
         <w:jc w:val="both"/>
       </w:pPr>
       <w:r>
@@ -1414,7 +1425,7 @@
     <w:p>
       <w:pPr>
         <w:spacing w:after="40"/>
-        <w:ind w:left="432" w:hanging="288"/>
+        <w:ind w:left="1008" w:hanging="288"/>
         <w:jc w:val="both"/>
       </w:pPr>
       <w:r>
@@ -1455,6 +1466,7 @@
     <w:p>
       <w:pPr>
         <w:spacing w:after="50"/>
+        <w:ind w:left="576" w:firstLine="504"/>
         <w:jc w:val="both"/>
       </w:pPr>
       <w:r>
@@ -1478,7 +1490,7 @@
           <w:noProof/>
         </w:rPr>
         <w:drawing>
-          <wp:inline distT="0" distB="0" distL="0" distR="0">
+          <wp:inline distT="0" distB="0" distL="0" distR="0" wp14:anchorId="4C9A74F8" wp14:editId="5C863558">
             <wp:extent cx="5507990" cy="1927796"/>
             <wp:effectExtent l="0" t="0" r="0" b="0"/>
             <wp:docPr id="2" name="Picture 2"/>
@@ -1532,6 +1544,7 @@
       <w:pPr>
         <w:keepNext/>
         <w:spacing w:before="120" w:after="40"/>
+        <w:ind w:left="576"/>
       </w:pPr>
       <w:r>
         <w:rPr>
@@ -1543,7 +1556,7 @@
     <w:p>
       <w:pPr>
         <w:spacing w:after="40"/>
-        <w:ind w:left="432" w:hanging="360"/>
+        <w:ind w:left="1008" w:hanging="360"/>
         <w:jc w:val="both"/>
       </w:pPr>
       <w:r>
@@ -1556,6 +1569,7 @@
     <w:p>
       <w:pPr>
         <w:spacing w:after="50"/>
+        <w:ind w:left="576" w:firstLine="504"/>
         <w:jc w:val="both"/>
       </w:pPr>
       <w:r>
@@ -1565,7 +1579,7 @@
     <w:p>
       <w:pPr>
         <w:spacing w:after="40"/>
-        <w:ind w:left="432" w:hanging="288"/>
+        <w:ind w:left="1008" w:hanging="288"/>
         <w:jc w:val="both"/>
       </w:pPr>
       <w:r>
@@ -1575,7 +1589,7 @@
     <w:p>
       <w:pPr>
         <w:spacing w:after="40"/>
-        <w:ind w:left="432" w:hanging="288"/>
+        <w:ind w:left="1008" w:hanging="288"/>
         <w:jc w:val="both"/>
       </w:pPr>
       <w:r>
@@ -1585,7 +1599,7 @@
     <w:p>
       <w:pPr>
         <w:spacing w:after="40"/>
-        <w:ind w:left="432" w:hanging="288"/>
+        <w:ind w:left="1008" w:hanging="288"/>
         <w:jc w:val="both"/>
       </w:pPr>
       <w:r>
@@ -1595,7 +1609,7 @@
     <w:p>
       <w:pPr>
         <w:spacing w:after="40"/>
-        <w:ind w:left="432" w:hanging="288"/>
+        <w:ind w:left="1008" w:hanging="288"/>
         <w:jc w:val="both"/>
       </w:pPr>
       <w:r>
@@ -1614,7 +1628,7 @@
     <w:p>
       <w:pPr>
         <w:spacing w:after="40"/>
-        <w:ind w:left="432" w:hanging="360"/>
+        <w:ind w:left="1008" w:hanging="360"/>
         <w:jc w:val="both"/>
       </w:pPr>
       <w:r>
@@ -1633,6 +1647,7 @@
     <w:p>
       <w:pPr>
         <w:spacing w:after="50"/>
+        <w:ind w:left="576" w:firstLine="504"/>
         <w:jc w:val="both"/>
       </w:pPr>
       <w:r>
@@ -1660,7 +1675,7 @@
     <w:p>
       <w:pPr>
         <w:spacing w:after="40"/>
-        <w:ind w:left="432" w:hanging="360"/>
+        <w:ind w:left="1008" w:hanging="360"/>
         <w:jc w:val="both"/>
       </w:pPr>
       <w:r>
@@ -1673,6 +1688,7 @@
     <w:p>
       <w:pPr>
         <w:spacing w:after="50"/>
+        <w:ind w:left="576" w:firstLine="504"/>
         <w:jc w:val="both"/>
       </w:pPr>
       <w:r>
@@ -1682,7 +1698,7 @@
     <w:p>
       <w:pPr>
         <w:spacing w:after="40"/>
-        <w:ind w:left="432" w:hanging="288"/>
+        <w:ind w:left="1008" w:hanging="288"/>
         <w:jc w:val="both"/>
       </w:pPr>
       <w:r>
@@ -1707,7 +1723,7 @@
     <w:p>
       <w:pPr>
         <w:spacing w:after="40"/>
-        <w:ind w:left="432" w:hanging="288"/>
+        <w:ind w:left="1008" w:hanging="288"/>
         <w:jc w:val="both"/>
       </w:pPr>
       <w:r>
@@ -1732,7 +1748,7 @@
     <w:p>
       <w:pPr>
         <w:spacing w:after="40"/>
-        <w:ind w:left="432" w:hanging="288"/>
+        <w:ind w:left="1008" w:hanging="288"/>
         <w:jc w:val="both"/>
       </w:pPr>
       <w:r>
@@ -1757,7 +1773,7 @@
     <w:p>
       <w:pPr>
         <w:spacing w:after="40"/>
-        <w:ind w:left="432" w:hanging="360"/>
+        <w:ind w:left="1008" w:hanging="360"/>
         <w:jc w:val="both"/>
       </w:pPr>
       <w:r>
@@ -1770,6 +1786,7 @@
     <w:p>
       <w:pPr>
         <w:spacing w:after="50"/>
+        <w:ind w:left="576" w:firstLine="504"/>
         <w:jc w:val="both"/>
       </w:pPr>
       <w:r>
@@ -1789,7 +1806,7 @@
     <w:p>
       <w:pPr>
         <w:spacing w:after="40"/>
-        <w:ind w:left="432" w:hanging="360"/>
+        <w:ind w:left="1008" w:hanging="360"/>
         <w:jc w:val="both"/>
       </w:pPr>
       <w:r>
@@ -1802,6 +1819,7 @@
     <w:p>
       <w:pPr>
         <w:spacing w:after="50"/>
+        <w:ind w:left="576" w:firstLine="504"/>
         <w:jc w:val="both"/>
       </w:pPr>
       <w:r>
@@ -1830,7 +1848,7 @@
     <w:p>
       <w:pPr>
         <w:spacing w:after="40"/>
-        <w:ind w:left="432" w:hanging="360"/>
+        <w:ind w:left="1008" w:hanging="360"/>
         <w:jc w:val="both"/>
       </w:pPr>
       <w:r>
@@ -1843,6 +1861,7 @@
     <w:p>
       <w:pPr>
         <w:spacing w:after="50"/>
+        <w:ind w:left="576" w:firstLine="504"/>
         <w:jc w:val="both"/>
       </w:pPr>
       <w:r>
@@ -1852,7 +1871,7 @@
     <w:p>
       <w:pPr>
         <w:spacing w:after="40"/>
-        <w:ind w:left="432" w:hanging="360"/>
+        <w:ind w:left="1008" w:hanging="360"/>
         <w:jc w:val="both"/>
       </w:pPr>
       <w:r>
@@ -1865,6 +1884,7 @@
     <w:p>
       <w:pPr>
         <w:spacing w:after="50"/>
+        <w:ind w:left="576" w:firstLine="504"/>
         <w:jc w:val="both"/>
       </w:pPr>
       <w:r>
@@ -1885,6 +1905,7 @@
       <w:pPr>
         <w:keepNext/>
         <w:spacing w:before="120" w:after="40"/>
+        <w:ind w:left="576"/>
       </w:pPr>
       <w:r>
         <w:rPr>
@@ -1896,7 +1917,7 @@
     <w:p>
       <w:pPr>
         <w:spacing w:after="40"/>
-        <w:ind w:left="432" w:hanging="288"/>
+        <w:ind w:left="1008" w:hanging="288"/>
         <w:jc w:val="both"/>
       </w:pPr>
       <w:r>
@@ -1915,7 +1936,7 @@
     <w:p>
       <w:pPr>
         <w:spacing w:after="40"/>
-        <w:ind w:left="432" w:hanging="288"/>
+        <w:ind w:left="1008" w:hanging="288"/>
         <w:jc w:val="both"/>
       </w:pPr>
       <w:r>
@@ -1953,6 +1974,7 @@
       <w:pPr>
         <w:keepNext/>
         <w:spacing w:before="120" w:after="40"/>
+        <w:ind w:left="576"/>
       </w:pPr>
       <w:r>
         <w:rPr>
@@ -1964,6 +1986,7 @@
     <w:p>
       <w:pPr>
         <w:spacing w:after="50"/>
+        <w:ind w:left="576" w:firstLine="504"/>
         <w:jc w:val="both"/>
       </w:pPr>
       <w:r>
@@ -1982,7 +2005,7 @@
     <w:p>
       <w:pPr>
         <w:spacing w:after="40"/>
-        <w:ind w:left="432" w:hanging="288"/>
+        <w:ind w:left="1008" w:hanging="288"/>
         <w:jc w:val="both"/>
       </w:pPr>
       <w:r>
@@ -2011,7 +2034,7 @@
     <w:p>
       <w:pPr>
         <w:spacing w:after="40"/>
-        <w:ind w:left="432" w:hanging="288"/>
+        <w:ind w:left="1008" w:hanging="288"/>
         <w:jc w:val="both"/>
       </w:pPr>
       <w:r>
@@ -2040,7 +2063,7 @@
     <w:p>
       <w:pPr>
         <w:spacing w:after="40"/>
-        <w:ind w:left="432" w:hanging="288"/>
+        <w:ind w:left="1008" w:hanging="288"/>
         <w:jc w:val="both"/>
       </w:pPr>
       <w:r>
@@ -2117,7 +2140,7 @@
           <w:noProof/>
         </w:rPr>
         <w:drawing>
-          <wp:inline distT="0" distB="0" distL="0" distR="0">
+          <wp:inline distT="0" distB="0" distL="0" distR="0" wp14:anchorId="23B95659" wp14:editId="183264F5">
             <wp:extent cx="5507990" cy="2203196"/>
             <wp:effectExtent l="0" t="0" r="0" b="0"/>
             <wp:docPr id="3" name="Picture 3"/>
@@ -2171,6 +2194,7 @@
       <w:pPr>
         <w:keepNext/>
         <w:spacing w:before="120" w:after="40"/>
+        <w:ind w:left="576"/>
       </w:pPr>
       <w:r>
         <w:rPr>
@@ -2182,6 +2206,7 @@
     <w:p>
       <w:pPr>
         <w:spacing w:after="50"/>
+        <w:ind w:left="576" w:firstLine="504"/>
         <w:jc w:val="both"/>
       </w:pPr>
       <w:r>
@@ -2192,6 +2217,7 @@
       <w:pPr>
         <w:keepNext/>
         <w:spacing w:before="120" w:after="40"/>
+        <w:ind w:left="576"/>
       </w:pPr>
       <w:r>
         <w:rPr>
@@ -2203,6 +2229,7 @@
     <w:p>
       <w:pPr>
         <w:spacing w:after="50"/>
+        <w:ind w:left="576" w:firstLine="504"/>
         <w:jc w:val="both"/>
       </w:pPr>
       <w:r>
@@ -2212,7 +2239,7 @@
     <w:p>
       <w:pPr>
         <w:spacing w:after="30" w:line="269" w:lineRule="auto"/>
-        <w:ind w:left="504" w:hanging="504"/>
+        <w:ind w:left="1008" w:hanging="432"/>
         <w:jc w:val="both"/>
       </w:pPr>
       <w:r>
@@ -2242,7 +2269,7 @@
     <w:p>
       <w:pPr>
         <w:spacing w:after="30" w:line="269" w:lineRule="auto"/>
-        <w:ind w:left="504" w:hanging="504"/>
+        <w:ind w:left="1008" w:hanging="432"/>
         <w:jc w:val="both"/>
       </w:pPr>
       <w:r>
@@ -2252,7 +2279,7 @@
     <w:p>
       <w:pPr>
         <w:spacing w:after="30" w:line="269" w:lineRule="auto"/>
-        <w:ind w:left="504" w:hanging="504"/>
+        <w:ind w:left="1008" w:hanging="432"/>
         <w:jc w:val="both"/>
       </w:pPr>
       <w:r>
@@ -2272,7 +2299,7 @@
     <w:p>
       <w:pPr>
         <w:spacing w:after="30" w:line="269" w:lineRule="auto"/>
-        <w:ind w:left="504" w:hanging="504"/>
+        <w:ind w:left="1008" w:hanging="432"/>
         <w:jc w:val="both"/>
       </w:pPr>
       <w:r>
@@ -2292,7 +2319,7 @@
     <w:p>
       <w:pPr>
         <w:spacing w:after="30" w:line="269" w:lineRule="auto"/>
-        <w:ind w:left="504" w:hanging="504"/>
+        <w:ind w:left="1008" w:hanging="432"/>
         <w:jc w:val="both"/>
       </w:pPr>
       <w:r>
@@ -2302,7 +2329,7 @@
     <w:p>
       <w:pPr>
         <w:spacing w:after="30" w:line="269" w:lineRule="auto"/>
-        <w:ind w:left="504" w:hanging="504"/>
+        <w:ind w:left="1008" w:hanging="432"/>
         <w:jc w:val="both"/>
       </w:pPr>
       <w:r>
@@ -2322,7 +2349,7 @@
     <w:p>
       <w:pPr>
         <w:spacing w:after="30" w:line="269" w:lineRule="auto"/>
-        <w:ind w:left="504" w:hanging="504"/>
+        <w:ind w:left="1008" w:hanging="432"/>
         <w:jc w:val="both"/>
       </w:pPr>
       <w:r>
@@ -2342,7 +2369,7 @@
     <w:p>
       <w:pPr>
         <w:spacing w:after="30" w:line="269" w:lineRule="auto"/>
-        <w:ind w:left="504" w:hanging="504"/>
+        <w:ind w:left="1008" w:hanging="432"/>
         <w:jc w:val="both"/>
       </w:pPr>
       <w:r>
@@ -2352,7 +2379,7 @@
     <w:p>
       <w:pPr>
         <w:spacing w:after="30" w:line="269" w:lineRule="auto"/>
-        <w:ind w:left="504" w:hanging="504"/>
+        <w:ind w:left="1008" w:hanging="432"/>
         <w:jc w:val="both"/>
       </w:pPr>
       <w:r>
@@ -2365,7 +2392,7 @@
     <w:p>
       <w:pPr>
         <w:spacing w:after="30" w:line="269" w:lineRule="auto"/>
-        <w:ind w:left="504" w:hanging="504"/>
+        <w:ind w:left="1008" w:hanging="432"/>
         <w:jc w:val="both"/>
       </w:pPr>
       <w:r>
@@ -2375,7 +2402,7 @@
     <w:p>
       <w:pPr>
         <w:spacing w:after="30" w:line="269" w:lineRule="auto"/>
-        <w:ind w:left="504" w:hanging="504"/>
+        <w:ind w:left="1008" w:hanging="432"/>
         <w:jc w:val="both"/>
       </w:pPr>
       <w:r>
@@ -2385,7 +2412,7 @@
     <w:p>
       <w:pPr>
         <w:spacing w:after="30" w:line="269" w:lineRule="auto"/>
-        <w:ind w:left="504" w:hanging="504"/>
+        <w:ind w:left="1008" w:hanging="432"/>
         <w:jc w:val="both"/>
       </w:pPr>
       <w:r>
@@ -2395,7 +2422,7 @@
     <w:p>
       <w:pPr>
         <w:spacing w:after="30" w:line="269" w:lineRule="auto"/>
-        <w:ind w:left="504" w:hanging="504"/>
+        <w:ind w:left="1008" w:hanging="432"/>
         <w:jc w:val="both"/>
       </w:pPr>
       <w:r>
@@ -2666,31 +2693,31 @@
       </w:rPr>
     </w:lvl>
   </w:abstractNum>
-  <w:num w:numId="1" w16cid:durableId="1631009077">
+  <w:num w:numId="1" w16cid:durableId="487333090">
     <w:abstractNumId w:val="8"/>
   </w:num>
-  <w:num w:numId="2" w16cid:durableId="741487848">
+  <w:num w:numId="2" w16cid:durableId="392850499">
     <w:abstractNumId w:val="6"/>
   </w:num>
-  <w:num w:numId="3" w16cid:durableId="2140758981">
+  <w:num w:numId="3" w16cid:durableId="1703822806">
     <w:abstractNumId w:val="5"/>
   </w:num>
-  <w:num w:numId="4" w16cid:durableId="262108034">
+  <w:num w:numId="4" w16cid:durableId="1011639318">
     <w:abstractNumId w:val="4"/>
   </w:num>
-  <w:num w:numId="5" w16cid:durableId="1627197667">
+  <w:num w:numId="5" w16cid:durableId="1365859764">
     <w:abstractNumId w:val="7"/>
   </w:num>
-  <w:num w:numId="6" w16cid:durableId="1165317749">
+  <w:num w:numId="6" w16cid:durableId="513569426">
     <w:abstractNumId w:val="3"/>
   </w:num>
-  <w:num w:numId="7" w16cid:durableId="496308311">
+  <w:num w:numId="7" w16cid:durableId="1537695476">
     <w:abstractNumId w:val="2"/>
   </w:num>
-  <w:num w:numId="8" w16cid:durableId="1011836710">
+  <w:num w:numId="8" w16cid:durableId="1303122359">
     <w:abstractNumId w:val="1"/>
   </w:num>
-  <w:num w:numId="9" w16cid:durableId="823081063">
+  <w:num w:numId="9" w16cid:durableId="1753965755">
     <w:abstractNumId w:val="0"/>
   </w:num>
 </w:numbering>

</xml_diff>